<commit_message>
Fact-check pass on talk script v2; OpenEvidence round-5 questions
Fixes: CDS Hooks 'chemo order being signed' -> 'new drug order being entered'
(order-select, not order-sign); 'one decision function / no clinical logic
anywhere else' softened to 'same normalizer and same engine'; 'every bundle'
-> 'every demo bundle'; 'relapsed lymphoma' -> 'lymphoma'.

Co-Authored-By: Claude Opus 5.5 <noreply@anthropic.com>
</commit_message>
<xml_diff>
--- a/submission/OncoVTE-Guard-Talk-Script.docx
+++ b/submission/OncoVTE-Guard-Talk-Script.docx
@@ -2092,7 +2092,7 @@
           <w:sz w:val="26"/>
           <w:szCs w:val="26"/>
         </w:rPr>
-        <w:t xml:space="preserve">It connects two ways. SMART App Launch, when a clinician opens it inside the chart. And CDS Hooks, when the EHR calls the same engine automatically at a workflow event — a chart opening, or a chemo order being signed.</w:t>
+        <w:t xml:space="preserve">It connects two ways. SMART App Launch, when a clinician opens it inside the chart. And CDS Hooks, when the EHR calls the same engine automatically at a workflow event — a chart opening, or a new drug order being entered.</w:t>
       </w:r>
     </w:p>
     <w:p>
@@ -2109,7 +2109,7 @@
           <w:sz w:val="26"/>
           <w:szCs w:val="26"/>
         </w:rPr>
-        <w:t xml:space="preserve">Both doors feed one normalizer and one decision function. No clinical logic lives anywhere else, so the dashboard and the EHR alert can't disagree.</w:t>
+        <w:t xml:space="preserve">Both doors run through the same normalizer and the same engine, so the dashboard and the EHR alert can't disagree.</w:t>
       </w:r>
     </w:p>
     <w:p>
@@ -2141,7 +2141,25 @@
         <w:t xml:space="preserve">Delivery note:</w:t>
       </w:r>
       <w:r>
-        <w:t xml:space="preserve"> This is the slide for the FHIR audience; Reviewer 1 asked for more here. "One engine, two doors" and "structured FHIR in, structured FHIR out" are the two lines to land. Present-capable wording for CDS Hooks ("calls the same engine"), not "a hospital is calling it."</w:t>
+        <w:t xml:space="preserve"> This is the slide for the FHIR audience; Reviewer 1 asked for more here. "One engine, two doors" and "structured FHIR in, structured FHIR out" are the two lines to land. Present-capable wording for CDS Hooks ("calls the same engine"), not "a hospital is calling it." The hooks are </w:t>
+      </w:r>
+      <w:r>
+        <w:rPr>
+          <w:rFonts w:ascii="Consolas" w:cs="Consolas" w:eastAsia="Consolas" w:hAnsi="Consolas"/>
+        </w:rPr>
+        <w:t xml:space="preserve">patient-view</w:t>
+      </w:r>
+      <w:r>
+        <w:t xml:space="preserve"> (chart opening) and </w:t>
+      </w:r>
+      <w:r>
+        <w:rPr>
+          <w:rFonts w:ascii="Consolas" w:cs="Consolas" w:eastAsia="Consolas" w:hAnsi="Consolas"/>
+        </w:rPr>
+        <w:t xml:space="preserve">order-select</w:t>
+      </w:r>
+      <w:r>
+        <w:t xml:space="preserve"> (an order being entered, not signed); the service runs, but it isn't hosted publicly.</w:t>
       </w:r>
     </w:p>
     <w:p>
@@ -2307,7 +2325,7 @@
           <w:sz w:val="26"/>
           <w:szCs w:val="26"/>
         </w:rPr>
-        <w:t xml:space="preserve">"James is 72, with relapsed lymphoma, and he's taking itraconazole for a serious fungal infection. His risk qualifies him for prophylaxis.</w:t>
+        <w:t xml:space="preserve">"James is 72, with lymphoma, and he's taking itraconazole for a serious fungal infection. His risk qualifies him for prophylaxis.</w:t>
       </w:r>
     </w:p>
     <w:p>
@@ -2472,7 +2490,7 @@
           <w:sz w:val="26"/>
           <w:szCs w:val="26"/>
         </w:rPr>
-        <w:t xml:space="preserve">"And here's that decision as FHIR. Each blocked drug becomes a DetectedIssue that points at the exact medication order that caused it — here, his itraconazole. The risk score becomes a RiskAssessment that points at the lab results it used. The recommendation becomes a draft proposal, never a signed order, and a Provenance record ties it all to the engine version. Every bundle passes the official HL7 validator, and it round-trips through a public FHIR server."</w:t>
+        <w:t xml:space="preserve">"And here's that decision as FHIR. Each blocked drug becomes a DetectedIssue that points at the exact medication order that caused it — here, his itraconazole. The risk score becomes a RiskAssessment that points at the lab results it used. The recommendation becomes a draft proposal, never a signed order, and a Provenance record ties it all to the engine version. Every demo bundle passes the official HL7 validator, and it round-trips through a public FHIR server."</w:t>
       </w:r>
     </w:p>
     <w:p>
@@ -2487,7 +2505,7 @@
         <w:t xml:space="preserve">Delivery note:</w:t>
       </w:r>
       <w:r>
-        <w:t xml:space="preserve"> This is the line that moves you from "an app that reads FHIR" to "a FHIR-native decision system." Point at the highlighted reference. Every claim here is verified: 0 validator errors on all 7 bundles; 9 resources in and 9 read back from the SMART sandbox.</w:t>
+        <w:t xml:space="preserve"> This is the line that moves you from "an app that reads FHIR" to "a FHIR-native decision system." Point at the highlighted reference. Every claim here is verified: 0 validator errors on all 7 demo bundles; 9 resources in and 9 read back from the SMART sandbox. Note the write-back comes from the app; the CDS Hooks service still returns cards.</w:t>
       </w:r>
     </w:p>
     <w:p>

</xml_diff>

<commit_message>
Apply OpenEvidence round 5 fact-check
All clinical claims confirmed. Wording: title corner stat (Holmes: dedicated
prevention program, high-risk = score >=3), 'pooled AVERT and CASSINI data
roughly halved VTE' (CASSINI ITT alone not significant). Display: fixed-dose
LMWH card source now 'NCCN VTE-B-2 (agent) · VTE-B-1 (standard dose)' since
VTE-B-2's printed LMWH doses are the pancreatic weight-based ones; James still
and clip re-captured (only that line changed). References added. Deployed.

Co-Authored-By: Claude Opus 5.5 <noreply@anthropic.com>
</commit_message>
<xml_diff>
--- a/submission/OncoVTE-Guard-Talk-Script.docx
+++ b/submission/OncoVTE-Guard-Talk-Script.docx
@@ -1492,7 +1492,7 @@
           <w:i/>
           <w:iCs/>
         </w:rPr>
-        <w:t xml:space="preserve">(small corner stat: only ~6 in 10 high-risk patients receive prophylaxis, even in a dedicated program — Holmes et al., JCO Oncology Practice 2026)</w:t>
+        <w:t xml:space="preserve">(small corner stat: Even in a dedicated prevention program, only ~6 in 10 high-risk patients received prophylaxis — Holmes et al., JCO Oncology Practice 2026)</w:t>
       </w:r>
     </w:p>
     <w:p>
@@ -1536,7 +1536,17 @@
         <w:t xml:space="preserve">Delivery note:</w:t>
       </w:r>
       <w:r>
-        <w:t xml:space="preserve"> Calm and evidence-first. The underuse number lives on the slide, not in your mouth. No credentials or personal background; your name and institution on the slide are enough.</w:t>
+        <w:t xml:space="preserve"> Calm and evidence-first. The underuse number lives on the slide, not in your mouth. Holmes defined "high-risk" as a Khorana </w:t>
+      </w:r>
+      <w:r>
+        <w:rPr>
+          <w:i/>
+          <w:iCs/>
+        </w:rPr>
+        <w:t xml:space="preserve">or</w:t>
+      </w:r>
+      <w:r>
+        <w:t xml:space="preserve"> PROTECHT score ≥3 (573 patients, 59% treated), so never tie that number to the app's ≥2 threshold; ≥2 is the trial and guideline threshold (AVERT, CASSINI, ITAC, NCCN, ASCO). No credentials or personal background; your name and institution on the slide are enough.</w:t>
       </w:r>
     </w:p>
     <w:p>
@@ -1869,7 +1879,7 @@
           <w:sz w:val="26"/>
           <w:szCs w:val="26"/>
         </w:rPr>
-        <w:t xml:space="preserve">"Prevention works — the AVERT and CASSINI trials showed that. The hard part is prescribing it safely, because five things have to be resolved at once: a risk score, bleeding risk, kidney function, drug interactions, and contraindications. One interacting drug can rule out both oral options; kidney function narrows what's left. Get it wrong one way, the patient clots. The other way, she bleeds.</w:t>
+        <w:t xml:space="preserve">"Prevention works — pooled AVERT and CASSINI data roughly halved VTE in higher-risk patients. The hard part is prescribing it safely, because five things have to be resolved at once: a risk score, bleeding risk, kidney function, drug interactions, and contraindications. One interacting drug can rule out both oral options; kidney function narrows what's left. Get it wrong one way, the patient clots. The other way, she bleeds.</w:t>
       </w:r>
     </w:p>
     <w:p>
@@ -1901,7 +1911,7 @@
         <w:t xml:space="preserve">Delivery note:</w:t>
       </w:r>
       <w:r>
-        <w:t xml:space="preserve"> This is shorter than v1 on purpose. Don't explain the risk score; the hard part is the collision, and James will show it. Reveal the chain last and let it sit for a beat.</w:t>
+        <w:t xml:space="preserve"> "Pooled … roughly halved" is deliberate: CASSINI's intention-to-treat primary endpoint alone wasn't significant (OpenEvidence round 5), so don't say the trials each "showed" it. This is shorter than v1 on purpose. Don't explain the risk score; the hard part is the collision, and James will show it. Reveal the chain last and let it sit for a beat.</w:t>
       </w:r>
     </w:p>
     <w:p>
@@ -3245,65 +3255,91 @@
         <w:pStyle w:val="Heading1"/>
       </w:pPr>
       <w:r>
-        <w:t xml:space="preserve">Verify before upload</w:t>
-      </w:r>
-    </w:p>
-    <w:p>
-      <w:pPr>
-        <w:pStyle w:val="ListParagraph"/>
-        <w:numPr>
-          <w:ilvl w:val="0"/>
-          <w:numId w:val="2"/>
-        </w:numPr>
-        <w:spacing w:after="60"/>
-      </w:pPr>
-      <w:r>
-        <w:t xml:space="preserve">Holmes et al., </w:t>
+        <w:t xml:space="preserve">Evidence check (OpenEvidence round 5, 2026-10-12): all clinical claims confirmed</w:t>
+      </w:r>
+    </w:p>
+    <w:p>
+      <w:pPr>
+        <w:pStyle w:val="ListParagraph"/>
+        <w:numPr>
+          <w:ilvl w:val="0"/>
+          <w:numId w:val="2"/>
+        </w:numPr>
+        <w:spacing w:after="60"/>
+      </w:pPr>
+      <w:r>
+        <w:t xml:space="preserve">Holmes 2026: real; 340 of 573 (59%) high-risk patients treated in the Vermont prevention program; "high-risk" = Khorana or PROTECHT ≥3. PMID 41941694, doi:10.1200/OP-25-01211.</w:t>
+      </w:r>
+    </w:p>
+    <w:p>
+      <w:pPr>
+        <w:pStyle w:val="ListParagraph"/>
+        <w:numPr>
+          <w:ilvl w:val="0"/>
+          <w:numId w:val="2"/>
+        </w:numPr>
+        <w:spacing w:after="60"/>
+      </w:pPr>
+      <w:r>
+        <w:t xml:space="preserve">Pooled AVERT + CASSINI overall VTE RR 0.56 (95% CI 0.35–0.89): correct, as reported in ITAC 2022 (Farge et al., </w:t>
       </w:r>
       <w:r>
         <w:rPr>
           <w:i/>
           <w:iCs/>
         </w:rPr>
-        <w:t xml:space="preserve">JCO Oncology Practice</w:t>
-      </w:r>
-      <w:r>
-        <w:t xml:space="preserve"> 2026: the "~6 in 10" / 59% figure (slide 1).</w:t>
-      </w:r>
-    </w:p>
-    <w:p>
-      <w:pPr>
-        <w:pStyle w:val="ListParagraph"/>
-        <w:numPr>
-          <w:ilvl w:val="0"/>
-          <w:numId w:val="2"/>
-        </w:numPr>
-        <w:spacing w:after="60"/>
-      </w:pPr>
-      <w:r>
-        <w:t xml:space="preserve">Pooled AVERT + CASSINI "RR 0.56" (slide 3 footnote).</w:t>
-      </w:r>
-    </w:p>
-    <w:p>
-      <w:pPr>
-        <w:pStyle w:val="ListParagraph"/>
-        <w:numPr>
-          <w:ilvl w:val="0"/>
-          <w:numId w:val="2"/>
-        </w:numPr>
-        <w:spacing w:after="60"/>
-      </w:pPr>
-      <w:r>
-        <w:t xml:space="preserve">Both are flagged in </w:t>
+        <w:t xml:space="preserve">Lancet Oncol</w:t>
+      </w:r>
+      <w:r>
+        <w:t xml:space="preserve"> 2022;23:e334–e347).</w:t>
+      </w:r>
+    </w:p>
+    <w:p>
+      <w:pPr>
+        <w:pStyle w:val="ListParagraph"/>
+        <w:numPr>
+          <w:ilvl w:val="0"/>
+          <w:numId w:val="2"/>
+        </w:numPr>
+        <w:spacing w:after="60"/>
+      </w:pPr>
+      <w:r>
+        <w:t xml:space="preserve">Label "avoid" for itraconazole with apixaban 2.5 mg BID and rivaroxaban; Khorana ≥350 boundary; Maria's score of 5; Dorothy's renal and platelet calls: all confirmed.</w:t>
+      </w:r>
+    </w:p>
+    <w:p>
+      <w:pPr>
+        <w:pStyle w:val="ListParagraph"/>
+        <w:numPr>
+          <w:ilvl w:val="0"/>
+          <w:numId w:val="2"/>
+        </w:numPr>
+        <w:spacing w:after="60"/>
+      </w:pPr>
+      <w:r>
+        <w:t xml:space="preserve">Wording changed: slide 1 corner stat; slide 3 "pooled … roughly halved"; the fixed-dose LMWH card source now reads "NCCN VTE-B-2 (agent) · VTE-B-1 (standard dose)", because VTE-B-2's printed LMWH doses are the pancreatic weight-based ones.</w:t>
+      </w:r>
+    </w:p>
+    <w:p>
+      <w:pPr>
+        <w:pStyle w:val="ListParagraph"/>
+        <w:numPr>
+          <w:ilvl w:val="0"/>
+          <w:numId w:val="2"/>
+        </w:numPr>
+        <w:spacing w:after="60"/>
+      </w:pPr>
+      <w:r>
+        <w:t xml:space="preserve">Full answer: </w:t>
       </w:r>
       <w:r>
         <w:rPr>
           <w:rFonts w:ascii="Consolas" w:cs="Consolas" w:eastAsia="Consolas" w:hAnsi="Consolas"/>
         </w:rPr>
-        <w:t xml:space="preserve">docs/PRESENTATION-APP-BRIEF.md</w:t>
-      </w:r>
-      <w:r>
-        <w:t xml:space="preserve">; neither is yet in </w:t>
+        <w:t xml:space="preserve">docs/OPENEVIDENCE-FACTCHECK-5.md</w:t>
+      </w:r>
+      <w:r>
+        <w:t xml:space="preserve">; references: </w:t>
       </w:r>
       <w:r>
         <w:rPr>
@@ -3400,7 +3436,7 @@
         <w:t xml:space="preserve">Running long:</w:t>
       </w:r>
       <w:r>
-        <w:t xml:space="preserve"> skip slide 8, then the "sign in" style asides, then trim Maria to one sentence.</w:t>
+        <w:t xml:space="preserve"> skip slide 8, then trim Maria to one sentence.</w:t>
       </w:r>
     </w:p>
     <w:p>

</xml_diff>